<commit_message>
feat: Added LR and also its draft
</commit_message>
<xml_diff>
--- a/Doc/Academic/Proposal/Litrature review Draft.docx
+++ b/Doc/Academic/Proposal/Litrature review Draft.docx
@@ -2012,8 +2012,887 @@
         <w:rPr>
           <w:rFonts w:ascii="Arial" w:hAnsi="Arial" w:cs="Arial"/>
         </w:rPr>
-      </w:pPr>
-    </w:p>
+        <w:sectPr>
+          <w:pgSz w:w="11906" w:h="16838"/>
+          <w:pgMar w:top="1440" w:right="1440" w:bottom="1440" w:left="1440" w:header="720" w:footer="720" w:gutter="0"/>
+          <w:cols w:space="720"/>
+          <w:docGrid w:linePitch="360"/>
+        </w:sectPr>
+      </w:pPr>
+    </w:p>
+    <w:tbl>
+      <w:tblPr>
+        <w:tblStyle w:val="TableGrid"/>
+        <w:tblW w:w="15930" w:type="dxa"/>
+        <w:tblInd w:w="-1085" w:type="dxa"/>
+        <w:tblLook w:val="04A0" w:firstRow="1" w:lastRow="0" w:firstColumn="1" w:lastColumn="0" w:noHBand="0" w:noVBand="1"/>
+      </w:tblPr>
+      <w:tblGrid>
+        <w:gridCol w:w="2425"/>
+        <w:gridCol w:w="2426"/>
+        <w:gridCol w:w="2431"/>
+        <w:gridCol w:w="1818"/>
+        <w:gridCol w:w="1961"/>
+        <w:gridCol w:w="2264"/>
+        <w:gridCol w:w="2605"/>
+      </w:tblGrid>
+      <w:tr>
+        <w:tc>
+          <w:tcPr>
+            <w:tcW w:w="2430" w:type="dxa"/>
+            <w:shd w:val="clear" w:color="auto" w:fill="595959" w:themeFill="text1" w:themeFillTint="A6"/>
+            <w:hideMark/>
+          </w:tcPr>
+          <w:p>
+            <w:pPr>
+              <w:spacing w:after="160" w:line="276" w:lineRule="auto"/>
+              <w:rPr>
+                <w:rFonts w:ascii="Arial" w:hAnsi="Arial" w:cs="Arial"/>
+                <w:b/>
+                <w:bCs/>
+                <w:color w:val="FFFFFF" w:themeColor="background1"/>
+              </w:rPr>
+            </w:pPr>
+            <w:r>
+              <w:rPr>
+                <w:rFonts w:ascii="Arial" w:hAnsi="Arial" w:cs="Arial"/>
+                <w:b/>
+                <w:bCs/>
+                <w:color w:val="FFFFFF" w:themeColor="background1"/>
+              </w:rPr>
+              <w:lastRenderedPageBreak/>
+              <w:t>Reference Bibliography (APA)</w:t>
+            </w:r>
+          </w:p>
+        </w:tc>
+        <w:tc>
+          <w:tcPr>
+            <w:tcW w:w="2430" w:type="dxa"/>
+            <w:shd w:val="clear" w:color="auto" w:fill="595959" w:themeFill="text1" w:themeFillTint="A6"/>
+            <w:hideMark/>
+          </w:tcPr>
+          <w:p>
+            <w:pPr>
+              <w:spacing w:after="160" w:line="276" w:lineRule="auto"/>
+              <w:rPr>
+                <w:rFonts w:ascii="Arial" w:hAnsi="Arial" w:cs="Arial"/>
+                <w:b/>
+                <w:bCs/>
+                <w:color w:val="FFFFFF" w:themeColor="background1"/>
+              </w:rPr>
+            </w:pPr>
+            <w:r>
+              <w:rPr>
+                <w:rFonts w:ascii="Arial" w:hAnsi="Arial" w:cs="Arial"/>
+                <w:b/>
+                <w:bCs/>
+                <w:color w:val="FFFFFF" w:themeColor="background1"/>
+              </w:rPr>
+              <w:t>Problem Statement</w:t>
+            </w:r>
+          </w:p>
+        </w:tc>
+        <w:tc>
+          <w:tcPr>
+            <w:tcW w:w="2434" w:type="dxa"/>
+            <w:shd w:val="clear" w:color="auto" w:fill="595959" w:themeFill="text1" w:themeFillTint="A6"/>
+            <w:hideMark/>
+          </w:tcPr>
+          <w:p>
+            <w:pPr>
+              <w:spacing w:after="160" w:line="276" w:lineRule="auto"/>
+              <w:rPr>
+                <w:rFonts w:ascii="Arial" w:hAnsi="Arial" w:cs="Arial"/>
+                <w:b/>
+                <w:bCs/>
+                <w:color w:val="FFFFFF" w:themeColor="background1"/>
+              </w:rPr>
+            </w:pPr>
+            <w:r>
+              <w:rPr>
+                <w:rFonts w:ascii="Arial" w:hAnsi="Arial" w:cs="Arial"/>
+                <w:b/>
+                <w:bCs/>
+                <w:color w:val="FFFFFF" w:themeColor="background1"/>
+              </w:rPr>
+              <w:t>Method Proposed</w:t>
+            </w:r>
+          </w:p>
+        </w:tc>
+        <w:tc>
+          <w:tcPr>
+            <w:tcW w:w="1796" w:type="dxa"/>
+            <w:shd w:val="clear" w:color="auto" w:fill="595959" w:themeFill="text1" w:themeFillTint="A6"/>
+            <w:hideMark/>
+          </w:tcPr>
+          <w:p>
+            <w:pPr>
+              <w:spacing w:after="160" w:line="276" w:lineRule="auto"/>
+              <w:rPr>
+                <w:rFonts w:ascii="Arial" w:hAnsi="Arial" w:cs="Arial"/>
+                <w:b/>
+                <w:bCs/>
+                <w:color w:val="FFFFFF" w:themeColor="background1"/>
+              </w:rPr>
+            </w:pPr>
+            <w:r>
+              <w:rPr>
+                <w:rFonts w:ascii="Arial" w:hAnsi="Arial" w:cs="Arial"/>
+                <w:b/>
+                <w:bCs/>
+                <w:color w:val="FFFFFF" w:themeColor="background1"/>
+              </w:rPr>
+              <w:t>Strength</w:t>
+            </w:r>
+          </w:p>
+        </w:tc>
+        <w:tc>
+          <w:tcPr>
+            <w:tcW w:w="1963" w:type="dxa"/>
+            <w:shd w:val="clear" w:color="auto" w:fill="595959" w:themeFill="text1" w:themeFillTint="A6"/>
+            <w:hideMark/>
+          </w:tcPr>
+          <w:p>
+            <w:pPr>
+              <w:spacing w:after="160" w:line="276" w:lineRule="auto"/>
+              <w:rPr>
+                <w:rFonts w:ascii="Arial" w:hAnsi="Arial" w:cs="Arial"/>
+                <w:b/>
+                <w:bCs/>
+                <w:color w:val="FFFFFF" w:themeColor="background1"/>
+              </w:rPr>
+            </w:pPr>
+            <w:r>
+              <w:rPr>
+                <w:rFonts w:ascii="Arial" w:hAnsi="Arial" w:cs="Arial"/>
+                <w:b/>
+                <w:bCs/>
+                <w:color w:val="FFFFFF" w:themeColor="background1"/>
+              </w:rPr>
+              <w:t>Weakness</w:t>
+            </w:r>
+          </w:p>
+        </w:tc>
+        <w:tc>
+          <w:tcPr>
+            <w:tcW w:w="2267" w:type="dxa"/>
+            <w:shd w:val="clear" w:color="auto" w:fill="595959" w:themeFill="text1" w:themeFillTint="A6"/>
+            <w:hideMark/>
+          </w:tcPr>
+          <w:p>
+            <w:pPr>
+              <w:spacing w:after="160" w:line="276" w:lineRule="auto"/>
+              <w:rPr>
+                <w:rFonts w:ascii="Arial" w:hAnsi="Arial" w:cs="Arial"/>
+                <w:b/>
+                <w:bCs/>
+                <w:color w:val="FFFFFF" w:themeColor="background1"/>
+              </w:rPr>
+            </w:pPr>
+            <w:r>
+              <w:rPr>
+                <w:rFonts w:ascii="Arial" w:hAnsi="Arial" w:cs="Arial"/>
+                <w:b/>
+                <w:bCs/>
+                <w:color w:val="FFFFFF" w:themeColor="background1"/>
+              </w:rPr>
+              <w:t>Results / Findings</w:t>
+            </w:r>
+          </w:p>
+        </w:tc>
+        <w:tc>
+          <w:tcPr>
+            <w:tcW w:w="2610" w:type="dxa"/>
+            <w:shd w:val="clear" w:color="auto" w:fill="595959" w:themeFill="text1" w:themeFillTint="A6"/>
+            <w:hideMark/>
+          </w:tcPr>
+          <w:p>
+            <w:pPr>
+              <w:spacing w:after="160" w:line="276" w:lineRule="auto"/>
+              <w:rPr>
+                <w:rFonts w:ascii="Arial" w:hAnsi="Arial" w:cs="Arial"/>
+                <w:b/>
+                <w:bCs/>
+                <w:color w:val="FFFFFF" w:themeColor="background1"/>
+              </w:rPr>
+            </w:pPr>
+            <w:r>
+              <w:rPr>
+                <w:rFonts w:ascii="Arial" w:hAnsi="Arial" w:cs="Arial"/>
+                <w:b/>
+                <w:bCs/>
+                <w:color w:val="FFFFFF" w:themeColor="background1"/>
+              </w:rPr>
+              <w:t>Future Direction</w:t>
+            </w:r>
+          </w:p>
+        </w:tc>
+      </w:tr>
+      <w:tr>
+        <w:tc>
+          <w:tcPr>
+            <w:tcW w:w="2430" w:type="dxa"/>
+            <w:shd w:val="clear" w:color="auto" w:fill="D9F2D0" w:themeFill="accent6" w:themeFillTint="33"/>
+            <w:hideMark/>
+          </w:tcPr>
+          <w:p>
+            <w:pPr>
+              <w:spacing w:after="160" w:line="276" w:lineRule="auto"/>
+              <w:rPr>
+                <w:rFonts w:ascii="Arial" w:hAnsi="Arial" w:cs="Arial"/>
+              </w:rPr>
+            </w:pPr>
+            <w:r>
+              <w:rPr>
+                <w:rFonts w:ascii="Arial" w:hAnsi="Arial" w:cs="Arial"/>
+              </w:rPr>
+              <w:t xml:space="preserve">Bhattacharya et al. (2024). </w:t>
+            </w:r>
+            <w:r>
+              <w:rPr>
+                <w:rFonts w:ascii="Arial" w:hAnsi="Arial" w:cs="Arial"/>
+                <w:i/>
+                <w:iCs/>
+              </w:rPr>
+              <w:t>Enhancing Digital Privacy with Zero-Knowledge Proofs.</w:t>
+            </w:r>
+          </w:p>
+        </w:tc>
+        <w:tc>
+          <w:tcPr>
+            <w:tcW w:w="2430" w:type="dxa"/>
+            <w:hideMark/>
+          </w:tcPr>
+          <w:p>
+            <w:pPr>
+              <w:spacing w:after="160" w:line="276" w:lineRule="auto"/>
+              <w:rPr>
+                <w:rFonts w:ascii="Arial" w:hAnsi="Arial" w:cs="Arial"/>
+              </w:rPr>
+            </w:pPr>
+            <w:r>
+              <w:rPr>
+                <w:rFonts w:ascii="Arial" w:hAnsi="Arial" w:cs="Arial"/>
+              </w:rPr>
+              <w:t>Current authentication systems leak personal info; privacy is weak.</w:t>
+            </w:r>
+          </w:p>
+        </w:tc>
+        <w:tc>
+          <w:tcPr>
+            <w:tcW w:w="2434" w:type="dxa"/>
+            <w:hideMark/>
+          </w:tcPr>
+          <w:p>
+            <w:pPr>
+              <w:spacing w:after="160" w:line="276" w:lineRule="auto"/>
+              <w:rPr>
+                <w:rFonts w:ascii="Arial" w:hAnsi="Arial" w:cs="Arial"/>
+              </w:rPr>
+            </w:pPr>
+            <w:r>
+              <w:rPr>
+                <w:rFonts w:ascii="Arial" w:hAnsi="Arial" w:cs="Arial"/>
+              </w:rPr>
+              <w:t>Comparative analysis of ZKP-based systems vs. traditional methods</w:t>
+            </w:r>
+          </w:p>
+        </w:tc>
+        <w:tc>
+          <w:tcPr>
+            <w:tcW w:w="1796" w:type="dxa"/>
+            <w:hideMark/>
+          </w:tcPr>
+          <w:p>
+            <w:pPr>
+              <w:spacing w:after="160" w:line="276" w:lineRule="auto"/>
+              <w:rPr>
+                <w:rFonts w:ascii="Arial" w:hAnsi="Arial" w:cs="Arial"/>
+              </w:rPr>
+            </w:pPr>
+            <w:r>
+              <w:rPr>
+                <w:rFonts w:ascii="Arial" w:hAnsi="Arial" w:cs="Arial"/>
+              </w:rPr>
+              <w:t>Clear explanation of ZKP types; strong comparison metrics</w:t>
+            </w:r>
+          </w:p>
+        </w:tc>
+        <w:tc>
+          <w:tcPr>
+            <w:tcW w:w="1963" w:type="dxa"/>
+            <w:hideMark/>
+          </w:tcPr>
+          <w:p>
+            <w:pPr>
+              <w:spacing w:after="160" w:line="276" w:lineRule="auto"/>
+              <w:rPr>
+                <w:rFonts w:ascii="Arial" w:hAnsi="Arial" w:cs="Arial"/>
+              </w:rPr>
+            </w:pPr>
+            <w:r>
+              <w:rPr>
+                <w:rFonts w:ascii="Arial" w:hAnsi="Arial" w:cs="Arial"/>
+              </w:rPr>
+              <w:t>Mostly theoretical; lacks real-world deployment examples</w:t>
+            </w:r>
+          </w:p>
+        </w:tc>
+        <w:tc>
+          <w:tcPr>
+            <w:tcW w:w="2267" w:type="dxa"/>
+            <w:hideMark/>
+          </w:tcPr>
+          <w:p>
+            <w:pPr>
+              <w:spacing w:after="160" w:line="276" w:lineRule="auto"/>
+              <w:rPr>
+                <w:rFonts w:ascii="Arial" w:hAnsi="Arial" w:cs="Arial"/>
+              </w:rPr>
+            </w:pPr>
+            <w:r>
+              <w:rPr>
+                <w:rFonts w:ascii="Arial" w:hAnsi="Arial" w:cs="Arial"/>
+              </w:rPr>
+              <w:t>ZKPs can verify user credentials without revealing personal data, scalable, privacy-friendly</w:t>
+            </w:r>
+          </w:p>
+        </w:tc>
+        <w:tc>
+          <w:tcPr>
+            <w:tcW w:w="2610" w:type="dxa"/>
+            <w:hideMark/>
+          </w:tcPr>
+          <w:p>
+            <w:pPr>
+              <w:spacing w:after="160" w:line="276" w:lineRule="auto"/>
+              <w:rPr>
+                <w:rFonts w:ascii="Arial" w:hAnsi="Arial" w:cs="Arial"/>
+              </w:rPr>
+            </w:pPr>
+            <w:r>
+              <w:rPr>
+                <w:rFonts w:ascii="Arial" w:hAnsi="Arial" w:cs="Arial"/>
+              </w:rPr>
+              <w:t>Implement ZKPs in real systems; optimize efficiency for large-scale use</w:t>
+            </w:r>
+          </w:p>
+        </w:tc>
+      </w:tr>
+      <w:tr>
+        <w:tc>
+          <w:tcPr>
+            <w:tcW w:w="2430" w:type="dxa"/>
+            <w:shd w:val="clear" w:color="auto" w:fill="D9F2D0" w:themeFill="accent6" w:themeFillTint="33"/>
+            <w:hideMark/>
+          </w:tcPr>
+          <w:p>
+            <w:pPr>
+              <w:spacing w:after="160" w:line="276" w:lineRule="auto"/>
+              <w:rPr>
+                <w:rFonts w:ascii="Arial" w:hAnsi="Arial" w:cs="Arial"/>
+              </w:rPr>
+            </w:pPr>
+            <w:r>
+              <w:rPr>
+                <w:rFonts w:ascii="Arial" w:hAnsi="Arial" w:cs="Arial"/>
+              </w:rPr>
+              <w:t xml:space="preserve">Gaurav et al. (2024). </w:t>
+            </w:r>
+            <w:r>
+              <w:rPr>
+                <w:rFonts w:ascii="Arial" w:hAnsi="Arial" w:cs="Arial"/>
+                <w:i/>
+                <w:iCs/>
+              </w:rPr>
+              <w:t>AI-Driven Smishing Detection in Android Devices.</w:t>
+            </w:r>
+          </w:p>
+        </w:tc>
+        <w:tc>
+          <w:tcPr>
+            <w:tcW w:w="2430" w:type="dxa"/>
+            <w:hideMark/>
+          </w:tcPr>
+          <w:p>
+            <w:pPr>
+              <w:spacing w:after="160" w:line="276" w:lineRule="auto"/>
+              <w:rPr>
+                <w:rFonts w:ascii="Arial" w:hAnsi="Arial" w:cs="Arial"/>
+              </w:rPr>
+            </w:pPr>
+            <w:r>
+              <w:rPr>
+                <w:rFonts w:ascii="Arial" w:hAnsi="Arial" w:cs="Arial"/>
+              </w:rPr>
+              <w:t>Traditional spam filters fail to detect complex smishing attacks</w:t>
+            </w:r>
+          </w:p>
+        </w:tc>
+        <w:tc>
+          <w:tcPr>
+            <w:tcW w:w="2434" w:type="dxa"/>
+            <w:hideMark/>
+          </w:tcPr>
+          <w:p>
+            <w:pPr>
+              <w:spacing w:after="160" w:line="276" w:lineRule="auto"/>
+              <w:rPr>
+                <w:rFonts w:ascii="Arial" w:hAnsi="Arial" w:cs="Arial"/>
+              </w:rPr>
+            </w:pPr>
+            <w:r>
+              <w:rPr>
+                <w:rFonts w:ascii="Arial" w:hAnsi="Arial" w:cs="Arial"/>
+              </w:rPr>
+              <w:t xml:space="preserve">Uses </w:t>
+            </w:r>
+            <w:proofErr w:type="spellStart"/>
+            <w:r>
+              <w:rPr>
+                <w:rFonts w:ascii="Arial" w:hAnsi="Arial" w:cs="Arial"/>
+              </w:rPr>
+              <w:t>TinyBERT</w:t>
+            </w:r>
+            <w:proofErr w:type="spellEnd"/>
+            <w:r>
+              <w:rPr>
+                <w:rFonts w:ascii="Arial" w:hAnsi="Arial" w:cs="Arial"/>
+              </w:rPr>
+              <w:t xml:space="preserve"> for feature extraction + Aquila Optimization to tune deep learning model</w:t>
+            </w:r>
+          </w:p>
+        </w:tc>
+        <w:tc>
+          <w:tcPr>
+            <w:tcW w:w="1796" w:type="dxa"/>
+            <w:hideMark/>
+          </w:tcPr>
+          <w:p>
+            <w:pPr>
+              <w:spacing w:after="160" w:line="276" w:lineRule="auto"/>
+              <w:rPr>
+                <w:rFonts w:ascii="Arial" w:hAnsi="Arial" w:cs="Arial"/>
+              </w:rPr>
+            </w:pPr>
+            <w:r>
+              <w:rPr>
+                <w:rFonts w:ascii="Arial" w:hAnsi="Arial" w:cs="Arial"/>
+              </w:rPr>
+              <w:t>High accuracy; robust AI approach</w:t>
+            </w:r>
+          </w:p>
+        </w:tc>
+        <w:tc>
+          <w:tcPr>
+            <w:tcW w:w="1963" w:type="dxa"/>
+            <w:hideMark/>
+          </w:tcPr>
+          <w:p>
+            <w:pPr>
+              <w:spacing w:after="160" w:line="276" w:lineRule="auto"/>
+              <w:rPr>
+                <w:rFonts w:ascii="Arial" w:hAnsi="Arial" w:cs="Arial"/>
+              </w:rPr>
+            </w:pPr>
+            <w:r>
+              <w:rPr>
+                <w:rFonts w:ascii="Arial" w:hAnsi="Arial" w:cs="Arial"/>
+              </w:rPr>
+              <w:t>Only tested on Android; dataset limitations</w:t>
+            </w:r>
+          </w:p>
+        </w:tc>
+        <w:tc>
+          <w:tcPr>
+            <w:tcW w:w="2267" w:type="dxa"/>
+            <w:hideMark/>
+          </w:tcPr>
+          <w:p>
+            <w:pPr>
+              <w:spacing w:after="160" w:line="276" w:lineRule="auto"/>
+              <w:rPr>
+                <w:rFonts w:ascii="Arial" w:hAnsi="Arial" w:cs="Arial"/>
+              </w:rPr>
+            </w:pPr>
+            <w:r>
+              <w:rPr>
+                <w:rFonts w:ascii="Arial" w:hAnsi="Arial" w:cs="Arial"/>
+              </w:rPr>
+              <w:t>Achieves 96.81% accuracy, outperforms GRU, LSTM, and SVM</w:t>
+            </w:r>
+          </w:p>
+        </w:tc>
+        <w:tc>
+          <w:tcPr>
+            <w:tcW w:w="2610" w:type="dxa"/>
+            <w:hideMark/>
+          </w:tcPr>
+          <w:p>
+            <w:pPr>
+              <w:spacing w:after="160" w:line="276" w:lineRule="auto"/>
+              <w:rPr>
+                <w:rFonts w:ascii="Arial" w:hAnsi="Arial" w:cs="Arial"/>
+              </w:rPr>
+            </w:pPr>
+            <w:r>
+              <w:rPr>
+                <w:rFonts w:ascii="Arial" w:hAnsi="Arial" w:cs="Arial"/>
+              </w:rPr>
+              <w:t>Extend to other mobile platforms; real-time detection; larger datasets</w:t>
+            </w:r>
+          </w:p>
+        </w:tc>
+      </w:tr>
+      <w:tr>
+        <w:tc>
+          <w:tcPr>
+            <w:tcW w:w="2430" w:type="dxa"/>
+            <w:shd w:val="clear" w:color="auto" w:fill="D9F2D0" w:themeFill="accent6" w:themeFillTint="33"/>
+            <w:hideMark/>
+          </w:tcPr>
+          <w:p>
+            <w:pPr>
+              <w:spacing w:after="160" w:line="276" w:lineRule="auto"/>
+              <w:rPr>
+                <w:rFonts w:ascii="Arial" w:hAnsi="Arial" w:cs="Arial"/>
+              </w:rPr>
+            </w:pPr>
+            <w:r>
+              <w:rPr>
+                <w:rFonts w:ascii="Arial" w:hAnsi="Arial" w:cs="Arial"/>
+              </w:rPr>
+              <w:t xml:space="preserve">Natha et al. (2022). </w:t>
+            </w:r>
+            <w:r>
+              <w:rPr>
+                <w:rFonts w:ascii="Arial" w:hAnsi="Arial" w:cs="Arial"/>
+                <w:i/>
+                <w:iCs/>
+              </w:rPr>
+              <w:t>Systematic Review of Anomaly Detection.</w:t>
+            </w:r>
+          </w:p>
+        </w:tc>
+        <w:tc>
+          <w:tcPr>
+            <w:tcW w:w="2430" w:type="dxa"/>
+            <w:hideMark/>
+          </w:tcPr>
+          <w:p>
+            <w:pPr>
+              <w:spacing w:after="160" w:line="276" w:lineRule="auto"/>
+              <w:rPr>
+                <w:rFonts w:ascii="Arial" w:hAnsi="Arial" w:cs="Arial"/>
+              </w:rPr>
+            </w:pPr>
+            <w:r>
+              <w:rPr>
+                <w:rFonts w:ascii="Arial" w:hAnsi="Arial" w:cs="Arial"/>
+              </w:rPr>
+              <w:t>Detecting anomalies is hard due to small anomalous data, varying environments, insufficient datasets</w:t>
+            </w:r>
+          </w:p>
+        </w:tc>
+        <w:tc>
+          <w:tcPr>
+            <w:tcW w:w="2434" w:type="dxa"/>
+            <w:hideMark/>
+          </w:tcPr>
+          <w:p>
+            <w:pPr>
+              <w:spacing w:after="160" w:line="276" w:lineRule="auto"/>
+              <w:rPr>
+                <w:rFonts w:ascii="Arial" w:hAnsi="Arial" w:cs="Arial"/>
+              </w:rPr>
+            </w:pPr>
+            <w:r>
+              <w:rPr>
+                <w:rFonts w:ascii="Arial" w:hAnsi="Arial" w:cs="Arial"/>
+              </w:rPr>
+              <w:t>Systematic review of recent ML/DL anomaly detection techniques (2019–2021)</w:t>
+            </w:r>
+          </w:p>
+        </w:tc>
+        <w:tc>
+          <w:tcPr>
+            <w:tcW w:w="1796" w:type="dxa"/>
+            <w:hideMark/>
+          </w:tcPr>
+          <w:p>
+            <w:pPr>
+              <w:spacing w:after="160" w:line="276" w:lineRule="auto"/>
+              <w:rPr>
+                <w:rFonts w:ascii="Arial" w:hAnsi="Arial" w:cs="Arial"/>
+              </w:rPr>
+            </w:pPr>
+            <w:r>
+              <w:rPr>
+                <w:rFonts w:ascii="Arial" w:hAnsi="Arial" w:cs="Arial"/>
+              </w:rPr>
+              <w:t>Comprehensive; covers ML &amp; DL techniques and datasets</w:t>
+            </w:r>
+          </w:p>
+        </w:tc>
+        <w:tc>
+          <w:tcPr>
+            <w:tcW w:w="1963" w:type="dxa"/>
+            <w:hideMark/>
+          </w:tcPr>
+          <w:p>
+            <w:pPr>
+              <w:spacing w:after="160" w:line="276" w:lineRule="auto"/>
+              <w:rPr>
+                <w:rFonts w:ascii="Arial" w:hAnsi="Arial" w:cs="Arial"/>
+              </w:rPr>
+            </w:pPr>
+            <w:r>
+              <w:rPr>
+                <w:rFonts w:ascii="Arial" w:hAnsi="Arial" w:cs="Arial"/>
+              </w:rPr>
+              <w:t>Mostly theoretical; no experimental validation</w:t>
+            </w:r>
+          </w:p>
+        </w:tc>
+        <w:tc>
+          <w:tcPr>
+            <w:tcW w:w="2267" w:type="dxa"/>
+            <w:hideMark/>
+          </w:tcPr>
+          <w:p>
+            <w:pPr>
+              <w:spacing w:after="160" w:line="276" w:lineRule="auto"/>
+              <w:rPr>
+                <w:rFonts w:ascii="Arial" w:hAnsi="Arial" w:cs="Arial"/>
+              </w:rPr>
+            </w:pPr>
+            <w:r>
+              <w:rPr>
+                <w:rFonts w:ascii="Arial" w:hAnsi="Arial" w:cs="Arial"/>
+              </w:rPr>
+              <w:t>ML and DL techniques improving detection across industries; datasets and metrics vary</w:t>
+            </w:r>
+          </w:p>
+        </w:tc>
+        <w:tc>
+          <w:tcPr>
+            <w:tcW w:w="2610" w:type="dxa"/>
+            <w:hideMark/>
+          </w:tcPr>
+          <w:p>
+            <w:pPr>
+              <w:spacing w:after="160" w:line="276" w:lineRule="auto"/>
+              <w:rPr>
+                <w:rFonts w:ascii="Arial" w:hAnsi="Arial" w:cs="Arial"/>
+              </w:rPr>
+            </w:pPr>
+            <w:r>
+              <w:rPr>
+                <w:rFonts w:ascii="Arial" w:hAnsi="Arial" w:cs="Arial"/>
+              </w:rPr>
+              <w:t>Develop better datasets; unify evaluation metrics; combine ML &amp; DL methods</w:t>
+            </w:r>
+          </w:p>
+        </w:tc>
+      </w:tr>
+      <w:tr>
+        <w:tc>
+          <w:tcPr>
+            <w:tcW w:w="2430" w:type="dxa"/>
+            <w:shd w:val="clear" w:color="auto" w:fill="D9F2D0" w:themeFill="accent6" w:themeFillTint="33"/>
+            <w:hideMark/>
+          </w:tcPr>
+          <w:p>
+            <w:pPr>
+              <w:spacing w:after="160" w:line="276" w:lineRule="auto"/>
+              <w:rPr>
+                <w:rFonts w:ascii="Arial" w:hAnsi="Arial" w:cs="Arial"/>
+              </w:rPr>
+            </w:pPr>
+            <w:proofErr w:type="spellStart"/>
+            <w:r>
+              <w:rPr>
+                <w:rFonts w:ascii="Arial" w:hAnsi="Arial" w:cs="Arial"/>
+              </w:rPr>
+              <w:t>Alatawi</w:t>
+            </w:r>
+            <w:proofErr w:type="spellEnd"/>
+            <w:r>
+              <w:rPr>
+                <w:rFonts w:ascii="Arial" w:hAnsi="Arial" w:cs="Arial"/>
+              </w:rPr>
+              <w:t xml:space="preserve"> (2022). </w:t>
+            </w:r>
+            <w:proofErr w:type="spellStart"/>
+            <w:r>
+              <w:rPr>
+                <w:rFonts w:ascii="Arial" w:hAnsi="Arial" w:cs="Arial"/>
+                <w:i/>
+                <w:iCs/>
+              </w:rPr>
+              <w:t>SoK</w:t>
+            </w:r>
+            <w:proofErr w:type="spellEnd"/>
+            <w:r>
+              <w:rPr>
+                <w:rFonts w:ascii="Arial" w:hAnsi="Arial" w:cs="Arial"/>
+                <w:i/>
+                <w:iCs/>
+              </w:rPr>
+              <w:t xml:space="preserve"> on E2EE and Authentication in Messaging Apps.</w:t>
+            </w:r>
+          </w:p>
+        </w:tc>
+        <w:tc>
+          <w:tcPr>
+            <w:tcW w:w="2430" w:type="dxa"/>
+            <w:hideMark/>
+          </w:tcPr>
+          <w:p>
+            <w:pPr>
+              <w:spacing w:after="160" w:line="276" w:lineRule="auto"/>
+              <w:rPr>
+                <w:rFonts w:ascii="Arial" w:hAnsi="Arial" w:cs="Arial"/>
+              </w:rPr>
+            </w:pPr>
+            <w:r>
+              <w:rPr>
+                <w:rFonts w:ascii="Arial" w:hAnsi="Arial" w:cs="Arial"/>
+              </w:rPr>
+              <w:t>Popular apps vulnerable to MitM attacks due to weak authentication ceremonies</w:t>
+            </w:r>
+          </w:p>
+        </w:tc>
+        <w:tc>
+          <w:tcPr>
+            <w:tcW w:w="2434" w:type="dxa"/>
+            <w:hideMark/>
+          </w:tcPr>
+          <w:p>
+            <w:pPr>
+              <w:spacing w:after="160" w:line="276" w:lineRule="auto"/>
+              <w:rPr>
+                <w:rFonts w:ascii="Arial" w:hAnsi="Arial" w:cs="Arial"/>
+              </w:rPr>
+            </w:pPr>
+            <w:r>
+              <w:rPr>
+                <w:rFonts w:ascii="Arial" w:hAnsi="Arial" w:cs="Arial"/>
+              </w:rPr>
+              <w:t>Systematization of knowledge (</w:t>
+            </w:r>
+            <w:proofErr w:type="spellStart"/>
+            <w:r>
+              <w:rPr>
+                <w:rFonts w:ascii="Arial" w:hAnsi="Arial" w:cs="Arial"/>
+              </w:rPr>
+              <w:t>SoK</w:t>
+            </w:r>
+            <w:proofErr w:type="spellEnd"/>
+            <w:r>
+              <w:rPr>
+                <w:rFonts w:ascii="Arial" w:hAnsi="Arial" w:cs="Arial"/>
+              </w:rPr>
+              <w:t xml:space="preserve">) </w:t>
+            </w:r>
+            <w:proofErr w:type="spellStart"/>
+            <w:r>
+              <w:rPr>
+                <w:rFonts w:ascii="Arial" w:hAnsi="Arial" w:cs="Arial"/>
+              </w:rPr>
+              <w:t>analyzing</w:t>
+            </w:r>
+            <w:proofErr w:type="spellEnd"/>
+            <w:r>
+              <w:rPr>
+                <w:rFonts w:ascii="Arial" w:hAnsi="Arial" w:cs="Arial"/>
+              </w:rPr>
+              <w:t xml:space="preserve"> multiple apps and their authentication flows</w:t>
+            </w:r>
+          </w:p>
+        </w:tc>
+        <w:tc>
+          <w:tcPr>
+            <w:tcW w:w="1796" w:type="dxa"/>
+            <w:hideMark/>
+          </w:tcPr>
+          <w:p>
+            <w:pPr>
+              <w:spacing w:after="160" w:line="276" w:lineRule="auto"/>
+              <w:rPr>
+                <w:rFonts w:ascii="Arial" w:hAnsi="Arial" w:cs="Arial"/>
+              </w:rPr>
+            </w:pPr>
+            <w:r>
+              <w:rPr>
+                <w:rFonts w:ascii="Arial" w:hAnsi="Arial" w:cs="Arial"/>
+              </w:rPr>
+              <w:t>Broad analysis; highlights key vulnerabilities</w:t>
+            </w:r>
+          </w:p>
+        </w:tc>
+        <w:tc>
+          <w:tcPr>
+            <w:tcW w:w="1963" w:type="dxa"/>
+            <w:hideMark/>
+          </w:tcPr>
+          <w:p>
+            <w:pPr>
+              <w:spacing w:after="160" w:line="276" w:lineRule="auto"/>
+              <w:rPr>
+                <w:rFonts w:ascii="Arial" w:hAnsi="Arial" w:cs="Arial"/>
+              </w:rPr>
+            </w:pPr>
+            <w:r>
+              <w:rPr>
+                <w:rFonts w:ascii="Arial" w:hAnsi="Arial" w:cs="Arial"/>
+              </w:rPr>
+              <w:t>Descriptive only; does not provide a new solution</w:t>
+            </w:r>
+          </w:p>
+        </w:tc>
+        <w:tc>
+          <w:tcPr>
+            <w:tcW w:w="2267" w:type="dxa"/>
+            <w:hideMark/>
+          </w:tcPr>
+          <w:p>
+            <w:pPr>
+              <w:spacing w:after="160" w:line="276" w:lineRule="auto"/>
+              <w:rPr>
+                <w:rFonts w:ascii="Arial" w:hAnsi="Arial" w:cs="Arial"/>
+              </w:rPr>
+            </w:pPr>
+            <w:r>
+              <w:rPr>
+                <w:rFonts w:ascii="Arial" w:hAnsi="Arial" w:cs="Arial"/>
+              </w:rPr>
+              <w:t>Most apps fail to defend against MitM; authentication is insecure</w:t>
+            </w:r>
+          </w:p>
+        </w:tc>
+        <w:tc>
+          <w:tcPr>
+            <w:tcW w:w="2610" w:type="dxa"/>
+            <w:hideMark/>
+          </w:tcPr>
+          <w:p>
+            <w:pPr>
+              <w:spacing w:after="160" w:line="276" w:lineRule="auto"/>
+              <w:rPr>
+                <w:rFonts w:ascii="Arial" w:hAnsi="Arial" w:cs="Arial"/>
+              </w:rPr>
+            </w:pPr>
+            <w:r>
+              <w:rPr>
+                <w:rFonts w:ascii="Arial" w:hAnsi="Arial" w:cs="Arial"/>
+              </w:rPr>
+              <w:t>Develop stronger authentication ceremonies; improve usability; enhance E2EE protocols</w:t>
+            </w:r>
+          </w:p>
+        </w:tc>
+      </w:tr>
+    </w:tbl>
     <w:p>
       <w:pPr>
         <w:spacing w:line="360" w:lineRule="auto"/>
@@ -2023,7 +2902,7 @@
       </w:pPr>
     </w:p>
     <w:sectPr>
-      <w:pgSz w:w="11906" w:h="16838"/>
+      <w:pgSz w:w="16838" w:h="11906" w:orient="landscape"/>
       <w:pgMar w:top="1440" w:right="1440" w:bottom="1440" w:left="1440" w:header="720" w:footer="720" w:gutter="0"/>
       <w:cols w:space="720"/>
       <w:docGrid w:linePitch="360"/>
@@ -5027,4 +5906,16 @@
     </a:ext>
   </a:extLst>
 </a:theme>
+</file>
+
+<file path=customXml/item1.xml><?xml version="1.0" encoding="utf-8"?>
+<b:Sources xmlns:b="http://schemas.openxmlformats.org/officeDocument/2006/bibliography" xmlns="http://schemas.openxmlformats.org/officeDocument/2006/bibliography" SelectedStyle="\APASixthEditionOfficeOnline.xsl" StyleName="APA" Version="6"/>
+</file>
+
+<file path=customXml/itemProps1.xml><?xml version="1.0" encoding="utf-8"?>
+<ds:datastoreItem xmlns:ds="http://schemas.openxmlformats.org/officeDocument/2006/customXml" ds:itemID="{9354AAE0-C8B6-43CD-BC39-1027CBBF664C}">
+  <ds:schemaRefs>
+    <ds:schemaRef ds:uri="http://schemas.openxmlformats.org/officeDocument/2006/bibliography"/>
+  </ds:schemaRefs>
+</ds:datastoreItem>
 </file>
</xml_diff>